<commit_message>
📄 : – refresh generated resume artifacts
</commit_message>
<xml_diff>
--- a/public/docs/resume/2026-06/resume.docx
+++ b/public/docs/resume/2026-06/resume.docx
@@ -708,10 +708,7 @@
         <w:t xml:space="preserve">GPA: 4.0</w:t>
       </w:r>
       <w:r>
-        <w:t xml:space="preserve"> </w:t>
-      </w:r>
-      <w:r>
-        <w:t xml:space="preserve">Aug 2015 – Aug 2016</w:t>
+        <w:t xml:space="preserve"> |  Aug 2015 – Aug 2016</w:t>
       </w:r>
       <w:r>
         <w:br/>
@@ -740,10 +737,7 @@
         <w:t xml:space="preserve">GPA: 4.0</w:t>
       </w:r>
       <w:r>
-        <w:t xml:space="preserve"> </w:t>
-      </w:r>
-      <w:r>
-        <w:t xml:space="preserve">May 2013 – May 2015</w:t>
+        <w:t xml:space="preserve"> |  May 2013 – May 2015</w:t>
       </w:r>
       <w:r>
         <w:br/>
@@ -772,10 +766,7 @@
         <w:t xml:space="preserve">GPA: 4.0</w:t>
       </w:r>
       <w:r>
-        <w:t xml:space="preserve"> </w:t>
-      </w:r>
-      <w:r>
-        <w:t xml:space="preserve">Aug 2011 – May 2013</w:t>
+        <w:t xml:space="preserve"> |  Aug 2011 – May 2013</w:t>
       </w:r>
     </w:p>
     <w:bookmarkEnd w:id="30"/>

</xml_diff>